<commit_message>
demo-kit: reframe the Design Document to three roles (VE · VRM · CSM)
</commit_message>
<xml_diff>
--- a/demo-kit/ValueLifecycle-Design-Document.docx
+++ b/demo-kit/ValueLifecycle-Design-Document.docx
@@ -24,7 +24,7 @@
           <w:iCs/>
           <w:color w:val="64748B"/>
         </w:rPr>
-        <w:t xml:space="preserve">One workspace for the whole value lifecycle — a value engineer who finds and quantifies value, and a realization manager who implements and proves it. This document explains the design and shows the workflow and architecture as diagrams.</w:t>
+        <w:t xml:space="preserve">One workspace for the whole value lifecycle — a value engineer who finds and quantifies value, a realization manager who implements and proves it, and a customer success manager who retains and grows the relationship. This document explains the design and shows the workflow and architecture as diagrams.</w:t>
       </w:r>
     </w:p>
     <w:p>
@@ -52,25 +52,25 @@
         <w:spacing w:after="120" w:line="264"/>
       </w:pPr>
       <w:r>
-        <w:t xml:space="preserve">Organisations are good at identifying value — value-engineering studies, business cases, board approvals — and poor at proving it was ever realized. The study lives in one team's deck; the realization lives in another team's spreadsheet; the link between them is an email thread. The Value Lifecycle Platform closes that loop by running both roles in one system and making the handover between them first-class.</w:t>
-      </w:r>
-    </w:p>
-    <w:p>
-      <w:pPr>
-        <w:spacing w:after="120" w:line="264"/>
-      </w:pPr>
-      <w:r>
-        <w:t xml:space="preserve">Two complementary roles, two structured methods: </w:t>
-      </w:r>
-      <w:r>
-        <w:rPr>
-          <w:b/>
-          <w:bCs/>
-        </w:rPr>
-        <w:t xml:space="preserve">the Value Engineer runs an 8-phase VE Job Plan; the Value Realization Manager runs a 7-phase realization lifecycle. </w:t>
-      </w:r>
-      <w:r>
-        <w:t xml:space="preserve">Every realization track traces back to the study, business case and success criteria it came from.</w:t>
+        <w:t xml:space="preserve">Organisations are good at identifying value — value-engineering studies, business cases, board approvals — and poor at proving it was ever realized, then keeping and growing the accounts where it was. The study lives in one team's deck; the realization lives in another team's spreadsheet; the renewal conversation runs on activity metrics rather than proven value; the links between them are email threads. The Value Lifecycle Platform closes that loop by running all three roles in one system and making the handovers between them first-class.</w:t>
+      </w:r>
+    </w:p>
+    <w:p>
+      <w:pPr>
+        <w:spacing w:after="120" w:line="264"/>
+      </w:pPr>
+      <w:r>
+        <w:t xml:space="preserve">Three complementary roles, three structured methods: </w:t>
+      </w:r>
+      <w:r>
+        <w:rPr>
+          <w:b/>
+          <w:bCs/>
+        </w:rPr>
+        <w:t xml:space="preserve">the Value Engineer runs an 8-phase VE Job Plan; the Value Realization Manager runs a 7-phase realization lifecycle; the Customer Success Manager runs a continuous 8-stage customer-success lifecycle. </w:t>
+      </w:r>
+      <w:r>
+        <w:t xml:space="preserve">Every realization track traces back to the study, business case and success criteria it came from — and every customer-success engagement references, but never re-keys, the value those studies and tracks prove.</w:t>
       </w:r>
     </w:p>
     <w:p>
@@ -144,7 +144,7 @@
         <w:spacing w:after="120" w:line="264"/>
       </w:pPr>
       <w:r>
-        <w:t xml:space="preserve">The engineering side ends where the realization side begins — at the handover. The two are deliberately different methods, joined by one required link.</w:t>
+        <w:t xml:space="preserve">The engineering side ends where the realization side begins — at the handover; realization ends at close-out, where Customer Success picks up the continuous relationship (§6). Three deliberately different methods, joined by first-class links.</w:t>
       </w:r>
     </w:p>
     <w:p>
@@ -450,15 +450,15 @@
         <w:rPr>
           <w:color w:val="2563EB"/>
         </w:rPr>
-        <w:t xml:space="preserve">6. System architecture</w:t>
-      </w:r>
-    </w:p>
-    <w:p>
-      <w:pPr>
-        <w:spacing w:after="120" w:line="264"/>
-      </w:pPr>
-      <w:r>
-        <w:t xml:space="preserve">A single-language, type-safe stack. Role-aware React Server Components render the dashboards; server actions and REST routes handle mutations and exports; Prisma talks to PostgreSQL through an organisation-scoped client; and the relational model holds the VE↔VR graph together.</w:t>
+        <w:t xml:space="preserve">6. Customer Success — the continuing relationship</w:t>
+      </w:r>
+    </w:p>
+    <w:p>
+      <w:pPr>
+        <w:spacing w:after="120" w:line="264"/>
+      </w:pPr>
+      <w:r>
+        <w:t xml:space="preserve">Value Realization proves one initiative and then ends at close-out; Customer Success is the continuous, per-account layer that carries the relationship on through renewal and expansion. It is a separate pillar with its own role (the CSM) and its own 8-stage lifecycle — not a change to VR.</w:t>
       </w:r>
     </w:p>
     <w:p>
@@ -469,7 +469,7 @@
       <w:r>
         <w:drawing>
           <wp:inline distT="0" distB="0" distL="0" distR="0">
-            <wp:extent cx="4381500" cy="2667000"/>
+            <wp:extent cx="5905500" cy="2390775"/>
             <wp:effectExtent t="0" r="0" b="0" l="0"/>
             <wp:docPr id="1" name="" descr="" title=""/>
             <wp:cNvGraphicFramePr>
@@ -494,6 +494,162 @@
                   <pic:spPr bwMode="auto">
                     <a:xfrm>
                       <a:off x="0" y="0"/>
+                      <a:ext cx="5905500" cy="2390775"/>
+                    </a:xfrm>
+                    <a:prstGeom prst="rect">
+                      <a:avLst/>
+                    </a:prstGeom>
+                  </pic:spPr>
+                </pic:pic>
+              </a:graphicData>
+            </a:graphic>
+          </wp:inline>
+        </w:drawing>
+      </w:r>
+    </w:p>
+    <w:p>
+      <w:pPr>
+        <w:pStyle w:val="ListParagraph"/>
+        <w:numPr>
+          <w:ilvl w:val="0"/>
+          <w:numId w:val="1"/>
+        </w:numPr>
+        <w:spacing w:after="60"/>
+      </w:pPr>
+      <w:r>
+        <w:rPr>
+          <w:b/>
+          <w:bCs/>
+        </w:rPr>
+        <w:t xml:space="preserve">References, never duplicates.</w:t>
+      </w:r>
+      <w:r>
+        <w:t xml:space="preserve"> A CS engagement links to the account's VE studies and VR tracks and surfaces their planned/realized value; the numbers still live on the tracks (single source of truth).</w:t>
+      </w:r>
+    </w:p>
+    <w:p>
+      <w:pPr>
+        <w:pStyle w:val="ListParagraph"/>
+        <w:numPr>
+          <w:ilvl w:val="0"/>
+          <w:numId w:val="1"/>
+        </w:numPr>
+        <w:spacing w:after="60"/>
+      </w:pPr>
+      <w:r>
+        <w:rPr>
+          <w:b/>
+          <w:bCs/>
+        </w:rPr>
+        <w:t xml:space="preserve">Health, proactively.</w:t>
+      </w:r>
+      <w:r>
+        <w:t xml:space="preserve"> A weighted </w:t>
+      </w:r>
+      <w:r>
+        <w:rPr>
+          <w:b/>
+          <w:bCs/>
+        </w:rPr>
+        <w:t xml:space="preserve">Health Scorecard</w:t>
+      </w:r>
+      <w:r>
+        <w:t xml:space="preserve"> (adoption, value, sentiment, support, engagement) rolls up to a green/amber/red band, and </w:t>
+      </w:r>
+      <w:r>
+        <w:rPr>
+          <w:b/>
+          <w:bCs/>
+        </w:rPr>
+        <w:t xml:space="preserve">attention signals</w:t>
+      </w:r>
+      <w:r>
+        <w:t xml:space="preserve"> flag renewals due, poor health, overdue actions, detractor stakeholders and value below plan — on the engagement and in the portfolio.</w:t>
+      </w:r>
+    </w:p>
+    <w:p>
+      <w:pPr>
+        <w:pStyle w:val="ListParagraph"/>
+        <w:numPr>
+          <w:ilvl w:val="0"/>
+          <w:numId w:val="1"/>
+        </w:numPr>
+        <w:spacing w:after="60"/>
+      </w:pPr>
+      <w:r>
+        <w:rPr>
+          <w:b/>
+          <w:bCs/>
+        </w:rPr>
+        <w:t xml:space="preserve">Governance &amp; growth.</w:t>
+      </w:r>
+      <w:r>
+        <w:t xml:space="preserve"> Stakeholder map, action log, renewal and growth plans; an </w:t>
+      </w:r>
+      <w:r>
+        <w:rPr>
+          <w:b/>
+          <w:bCs/>
+        </w:rPr>
+        <w:t xml:space="preserve">EBR narrative</w:t>
+      </w:r>
+      <w:r>
+        <w:t xml:space="preserve"> (AI via the Anthropic seam, or a template fallback) that seeds its next-best-actions into the action log; and an Account Success Review export.</w:t>
+      </w:r>
+    </w:p>
+    <w:p>
+      <w:pPr>
+        <w:pStyle w:val="Heading1"/>
+        <w:spacing w:after="100" w:before="300"/>
+      </w:pPr>
+      <w:r>
+        <w:rPr>
+          <w:color w:val="2563EB"/>
+        </w:rPr>
+        <w:t xml:space="preserve">7. System architecture</w:t>
+      </w:r>
+    </w:p>
+    <w:p>
+      <w:pPr>
+        <w:spacing w:after="120" w:line="264"/>
+      </w:pPr>
+      <w:r>
+        <w:t xml:space="preserve">A single-language, type-safe stack. Role-aware React Server Components render the dashboards; server actions and REST routes handle mutations and exports; Prisma talks to PostgreSQL through an organisation-scoped client; and the relational model holds the VE↔VR↔CS graph together.</w:t>
+      </w:r>
+    </w:p>
+    <w:p>
+      <w:pPr>
+        <w:spacing w:after="180" w:before="60"/>
+        <w:jc w:val="center"/>
+      </w:pPr>
+      <w:r>
+        <w:drawing>
+          <wp:inline distT="0" distB="0" distL="0" distR="0">
+            <wp:extent cx="4381500" cy="2667000"/>
+            <wp:effectExtent t="0" r="0" b="0" l="0"/>
+            <wp:docPr id="1" name="" descr="" title=""/>
+            <wp:cNvGraphicFramePr>
+              <a:graphicFrameLocks xmlns:a="http://schemas.openxmlformats.org/drawingml/2006/main" noChangeAspect="1"/>
+            </wp:cNvGraphicFramePr>
+            <a:graphic xmlns:a="http://schemas.openxmlformats.org/drawingml/2006/main">
+              <a:graphicData uri="http://schemas.openxmlformats.org/drawingml/2006/picture">
+                <pic:pic xmlns:pic="http://schemas.openxmlformats.org/drawingml/2006/picture">
+                  <pic:nvPicPr>
+                    <pic:cNvPr id="0" name="" descr=""/>
+                    <pic:cNvPicPr>
+                      <a:picLocks noChangeAspect="1" noChangeArrowheads="1"/>
+                    </pic:cNvPicPr>
+                  </pic:nvPicPr>
+                  <pic:blipFill>
+                    <a:blip r:embed="rId12" cstate="none"/>
+                    <a:srcRect/>
+                    <a:stretch>
+                      <a:fillRect/>
+                    </a:stretch>
+                  </pic:blipFill>
+                  <pic:spPr bwMode="auto">
+                    <a:xfrm>
+                      <a:off x="0" y="0"/>
                       <a:ext cx="4381500" cy="2667000"/>
                     </a:xfrm>
                     <a:prstGeom prst="rect">
@@ -561,6 +717,16 @@
           <w:rFonts w:ascii="Consolas" w:cs="Consolas" w:eastAsia="Consolas" w:hAnsi="Consolas"/>
           <w:color w:val="B91C1C"/>
         </w:rPr>
+        <w:t xml:space="preserve">/cs</w:t>
+      </w:r>
+      <w:r>
+        <w:t xml:space="preserve">, </w:t>
+      </w:r>
+      <w:r>
+        <w:rPr>
+          <w:rFonts w:ascii="Consolas" w:cs="Consolas" w:eastAsia="Consolas" w:hAnsi="Consolas"/>
+          <w:color w:val="B91C1C"/>
+        </w:rPr>
         <w:t xml:space="preserve">/kpis</w:t>
       </w:r>
       <w:r>
@@ -626,7 +792,7 @@
         <w:rPr>
           <w:color w:val="2563EB"/>
         </w:rPr>
-        <w:t xml:space="preserve">7. Domain &amp; data model</w:t>
+        <w:t xml:space="preserve">8. Domain &amp; data model</w:t>
       </w:r>
     </w:p>
     <w:p>
@@ -649,7 +815,7 @@
         <w:t xml:space="preserve">The bridge: </w:t>
       </w:r>
       <w:r>
-        <w:t xml:space="preserve">a HandoverArtifact captures each expected benefit, KPI, baseline, measurement plan and success criterion on the study, and is linked to the RealizationTrack on handover. RealizationTrack carries a required foreign key to its source Study. KPIs are modelled as KpiDefinition (catalogue) → KpiTarget (on a study or track) → KpiActual (time series). Comment, AuditEvent and DocumentVersion provide governance across the model.</w:t>
+        <w:t xml:space="preserve">a HandoverArtifact captures each expected benefit, KPI, baseline, measurement plan and success criterion on the study, and is linked to the RealizationTrack on handover. A track's studyId is optional — origin is VE_HANDOVER (has a source study) or STANDALONE (software already in place, no study). Customer Success adds CustomerSuccessEngagement → CsStageInstance plus Stakeholder, ActionItem, HealthScore, RenewalPlan and GrowthPlan; studies and tracks carry an optional engagementId so an engagement references them without copying. KPIs are modelled as KpiDefinition (catalogue) → KpiTarget (on a study or track) → KpiActual (time series). Comment, AuditEvent and DocumentVersion provide governance across the model.</w:t>
       </w:r>
     </w:p>
     <w:p>
@@ -661,15 +827,15 @@
         <w:rPr>
           <w:color w:val="2563EB"/>
         </w:rPr>
-        <w:t xml:space="preserve">8. Multi-tenancy, roles &amp; governance</w:t>
-      </w:r>
-    </w:p>
-    <w:p>
-      <w:pPr>
-        <w:spacing w:after="120" w:line="264"/>
-      </w:pPr>
-      <w:r>
-        <w:t xml:space="preserve">Self-service registration creates a new, isolated Organisation with the signer as Admin; every study and track is scoped to its organisation. Role-based access maps each role — Value Engineer, Value Realization Manager, Reviewer, Viewer, Admin — to a capability set enforced on the server; the UI merely hides what a role can't do.</w:t>
+        <w:t xml:space="preserve">9. Multi-tenancy, roles &amp; governance</w:t>
+      </w:r>
+    </w:p>
+    <w:p>
+      <w:pPr>
+        <w:spacing w:after="120" w:line="264"/>
+      </w:pPr>
+      <w:r>
+        <w:t xml:space="preserve">Self-service registration creates a new, isolated Organisation with the signer as Admin; every study and track is scoped to its organisation. Role-based access maps each role — Value Engineer, Value Realization Manager, Customer Success Manager, Reviewer, Viewer, Admin — to a capability set enforced on the server; the UI merely hides what a role can't do.</w:t>
       </w:r>
     </w:p>
     <w:p>
@@ -689,7 +855,7 @@
         <w:rPr>
           <w:color w:val="2563EB"/>
         </w:rPr>
-        <w:t xml:space="preserve">9. Key design principles</w:t>
+        <w:t xml:space="preserve">10. Key design principles</w:t>
       </w:r>
     </w:p>
     <w:tbl>
@@ -1013,7 +1179,7 @@
         <w:rPr>
           <w:color w:val="2563EB"/>
         </w:rPr>
-        <w:t xml:space="preserve">10. Technology stack</w:t>
+        <w:t xml:space="preserve">11. Technology stack</w:t>
       </w:r>
     </w:p>
     <w:p>
@@ -1033,7 +1199,7 @@
         <w:t xml:space="preserve">Frontend:</w:t>
       </w:r>
       <w:r>
-        <w:t xml:space="preserve"> Next.js 15 (App Router) · React Server Components · TypeScript (strict) · Tailwind CSS (VE = blue, VR = emerald)</w:t>
+        <w:t xml:space="preserve"> Next.js 15 (App Router) · React Server Components · TypeScript (strict) · Tailwind CSS (VE = blue, VR = emerald, CS = cyan)</w:t>
       </w:r>
     </w:p>
     <w:p>
@@ -1073,7 +1239,7 @@
         <w:t xml:space="preserve">Data:</w:t>
       </w:r>
       <w:r>
-        <w:t xml:space="preserve"> Prisma 6 · PostgreSQL — the VE↔VR relational graph</w:t>
+        <w:t xml:space="preserve"> Prisma 6 · PostgreSQL — the VE↔VR↔CS relational graph</w:t>
       </w:r>
     </w:p>
     <w:p>
@@ -1145,15 +1311,15 @@
         <w:rPr>
           <w:color w:val="2563EB"/>
         </w:rPr>
-        <w:t xml:space="preserve">11. What's built</w:t>
-      </w:r>
-    </w:p>
-    <w:p>
-      <w:pPr>
-        <w:spacing w:after="120" w:line="264"/>
-      </w:pPr>
-      <w:r>
-        <w:t xml:space="preserve">A complete Phase-1 platform: the 8-phase VE Job Plan with function analysis, a FAST diagram, a weighted evaluation matrix and inline editing throughout; a live business-case builder with the finance engine, multi-currency (ZAR default), version history and Word export; the first-class VE→VR handover; the 7-phase realization lifecycle with work packages, adoption plan, KPI tracker and benefits realization; portfolio and KPI dashboards; three industry profiles; real Auth.js login with role-based access; and self-service registration with admin team management including owner reassignment.</w:t>
+        <w:t xml:space="preserve">12. What's built</w:t>
+      </w:r>
+    </w:p>
+    <w:p>
+      <w:pPr>
+        <w:spacing w:after="120" w:line="264"/>
+      </w:pPr>
+      <w:r>
+        <w:t xml:space="preserve">A complete platform across all three pillars: the 8-phase VE Job Plan with function analysis, a FAST diagram, a weighted evaluation matrix and inline editing throughout; a live business-case builder with the finance engine, multi-currency, version history and Word export; the first-class VE→VR handover plus standalone VR tracks (software already in place); the 7-phase realization lifecycle with work packages, adoption plan, KPI tracker and benefits realization; the Customer Success pillar — per-account engagements, the 8-stage lifecycle, a weighted health scorecard, attention signals, stakeholder map, action log, renewal/growth plans, AI-assisted EBRs and an Account Success Review export; portfolio and KPI dashboards (with a CS lens); real Auth.js login with role-based access; self-service registration with admin team management including owner reassignment; and Excel capture-workbooks with an importer for all three pillars.</w:t>
       </w:r>
     </w:p>
     <w:p>
@@ -1166,7 +1332,7 @@
           <w:iCs/>
           <w:color w:val="64748B"/>
         </w:rPr>
-        <w:t xml:space="preserve">The Value Lifecycle Platform — one workspace that turns approved value into proven value, with a first-class handover so nothing is lost between the two.</w:t>
+        <w:t xml:space="preserve">The Value Lifecycle Platform — one workspace that turns approved value into proven value and proven value into a retained, growing relationship.</w:t>
       </w:r>
     </w:p>
     <w:sectPr>

</xml_diff>